<commit_message>
feat: expand platform scope to support individual, couple, and group financial management in documentation
</commit_message>
<xml_diff>
--- a/docs/DuoDocs/DEA_DuoBalance_v1.0.docx
+++ b/docs/DuoDocs/DEA_DuoBalance_v1.0.docx
@@ -146,7 +146,7 @@
           <w:sz w:val="22"/>
           <w:szCs w:val="22"/>
         </w:rPr>
-        <w:t xml:space="preserve">DuoBalance es una plataforma digital diseñada para la administración de gastos compartidos entre dos personas. La aplicación permite registrar gastos, almacenar comprobantes, calcular automáticamente las participaciones económicas de cada integrante y mantener un balance actualizado de deudas y pagos. El sistema busca reemplazar métodos informales de control financiero como conversaciones de mensajería, hojas de cálculo y registros manuales.</w:t>
+        <w:t xml:space="preserve">DuoBalance es una plataforma digital diseñada para la administración de gastos compartidos entre individuos, parejas y grupos. Soporta tres tipos de actores: 👤 Personal (control financiero individual), ❤️ Pareja (gastos compartidos entre dos) y 👥 Grupo (roommates, familia, viaje, amigos de 3+). La aplicación permite registrar gastos, almacenar comprobantes, calcular automáticamente las participaciones económicas de cada integrante y mantener un balance actualizado de deudas y pagos. El sistema busca reemplazar métodos informales de control financiero como conversaciones de mensajería, hojas de cálculo y registros manuales.</w:t>
       </w:r>
     </w:p>
     <w:p>
@@ -460,7 +460,7 @@
           <w:sz w:val="22"/>
           <w:szCs w:val="22"/>
         </w:rPr>
-        <w:t xml:space="preserve">Desarrollar una plataforma digital que facilite la administración de gastos compartidos entre dos personas mediante el registro de transacciones, cálculo automático de participaciones y visualización de balances financieros.</w:t>
+        <w:t xml:space="preserve">Desarrollar una plataforma digital que facilite la administración de gastos compartidos entre individuos, parejas y grupos (3+ personas) mediante el registro de transacciones, cálculo automático de participaciones y visualización de balances financieros.</w:t>
       </w:r>
     </w:p>
     <w:p>
@@ -717,7 +717,7 @@
           <w:sz w:val="22"/>
           <w:szCs w:val="22"/>
         </w:rPr>
-        <w:t xml:space="preserve">Gestión de parejas</w:t>
+        <w:t xml:space="preserve">Gestión de grupos</w:t>
       </w:r>
     </w:p>
     <w:p>
@@ -968,7 +968,7 @@
           <w:sz w:val="22"/>
           <w:szCs w:val="22"/>
         </w:rPr>
-        <w:t xml:space="preserve">Manejo de múltiples parejas por usuario</w:t>
+        <w:t xml:space="preserve">Integración bancaria</w:t>
       </w:r>
     </w:p>
     <w:p>
@@ -1125,7 +1125,7 @@
           <w:sz w:val="22"/>
           <w:szCs w:val="22"/>
         </w:rPr>
-        <w:t xml:space="preserve">Segundo integrante vinculado a la cuenta compartida. Posee los mismos permisos sobre los gastos y balances de la pareja.</w:t>
+        <w:t xml:space="preserve">Segundo integrante (o miembro de grupo) vinculado a la cuenta compartida. En el modo Pareja (2 personas) es el otro integrante; en modo Grupo pueden ser N miembros. Posee los mismos permisos sobre los gastos y balances del grupo.</w:t>
       </w:r>
     </w:p>
     <w:p>
@@ -1295,7 +1295,7 @@
                 <w:sz w:val="20"/>
                 <w:szCs w:val="20"/>
               </w:rPr>
-              <w:t xml:space="preserve">Una pareja estará compuesta por exactamente dos integrantes.</w:t>
+              <w:t xml:space="preserve">Una pareja (modo COUPLE) estará compuesta por exactamente dos integrantes. Un grupo (modo GROUP) puede tener 3 o más. Un grupo personal (modo PERSONAL) tiene un solo integrante.</w:t>
             </w:r>
           </w:p>
         </w:tc>
@@ -1354,7 +1354,7 @@
                 <w:sz w:val="20"/>
                 <w:szCs w:val="20"/>
               </w:rPr>
-              <w:t xml:space="preserve">Un usuario solo podrá pertenecer a una pareja activa.</w:t>
+              <w:t xml:space="preserve">Un usuario podrá pertenecer a uno o múltiples grupos, incluyendo su grupo personal, una o más parejas, y grupos con 3+ integrantes.</w:t>
             </w:r>
           </w:p>
         </w:tc>
@@ -1767,7 +1767,7 @@
                 <w:sz w:val="20"/>
                 <w:szCs w:val="20"/>
               </w:rPr>
-              <w:t xml:space="preserve">Solo los integrantes de una pareja pueden visualizar información financiera compartida.</w:t>
+              <w:t xml:space="preserve">Solo los integrantes de un grupo pueden visualizar información financiera compartida del mismo.</w:t>
             </w:r>
           </w:p>
         </w:tc>
@@ -2272,7 +2272,7 @@
           <w:sz w:val="26"/>
           <w:szCs w:val="26"/>
         </w:rPr>
-        <w:t xml:space="preserve">Módulo de Parejas</w:t>
+        <w:t xml:space="preserve">Módulo de Grupos</w:t>
       </w:r>
     </w:p>
     <w:tbl>
@@ -2409,7 +2409,7 @@
                 <w:sz w:val="20"/>
                 <w:szCs w:val="20"/>
               </w:rPr>
-              <w:t xml:space="preserve">El sistema debe permitir crear una pareja.</w:t>
+              <w:t xml:space="preserve">El sistema debe permitir crear un grupo (Personal, Pareja o Grupo).</w:t>
             </w:r>
           </w:p>
         </w:tc>
@@ -2527,7 +2527,7 @@
                 <w:sz w:val="20"/>
                 <w:szCs w:val="20"/>
               </w:rPr>
-              <w:t xml:space="preserve">El sistema debe permitir unirse a una pareja mediante código.</w:t>
+              <w:t xml:space="preserve">El sistema debe permitir unirse a un grupo mediante código.</w:t>
             </w:r>
           </w:p>
         </w:tc>
@@ -2586,7 +2586,7 @@
                 <w:sz w:val="20"/>
                 <w:szCs w:val="20"/>
               </w:rPr>
-              <w:t xml:space="preserve">El sistema debe permitir visualizar la información de la pareja vinculada.</w:t>
+              <w:t xml:space="preserve">El sistema debe permitir visualizar la información del grupo vinculado.</w:t>
             </w:r>
           </w:p>
         </w:tc>
@@ -5928,7 +5928,7 @@
           <w:sz w:val="22"/>
           <w:szCs w:val="22"/>
         </w:rPr>
-        <w:t xml:space="preserve">Crea pareja</w:t>
+        <w:t xml:space="preserve">Crear grupo</w:t>
       </w:r>
     </w:p>
     <w:p>
@@ -6515,7 +6515,7 @@
                 <w:sz w:val="20"/>
                 <w:szCs w:val="20"/>
               </w:rPr>
-              <w:t xml:space="preserve">id, usuario_id, pareja_id, porcentaje_participación</w:t>
+              <w:t xml:space="preserve">id, usuario_id, grupo_id, porcentaje_participación</w:t>
             </w:r>
           </w:p>
         </w:tc>
@@ -6574,7 +6574,7 @@
                 <w:sz w:val="20"/>
                 <w:szCs w:val="20"/>
               </w:rPr>
-              <w:t xml:space="preserve">id, pareja_id, usuario_pagador, descripción, valor, fecha, categoría, comprobante</w:t>
+              <w:t xml:space="preserve">id, grupo_id, usuario_pagador, descripción, valor, fecha, categoría, comprobante</w:t>
             </w:r>
           </w:p>
         </w:tc>

</xml_diff>